<commit_message>
User guide (EN): Exit Interviews - 'Who is leaving?' before 'Engagement drivers', shorter comment tables (5 -> 4 pages)
Co-Authored-By: Claude Sonnet 5.5 <noreply@anthropic.com>
Claude-Session: https://claude.ai/code/session_019dELNUNjVMr3Ja2mUwBrCu
</commit_message>
<xml_diff>
--- a/docs/user-guide/en/pages/09-exitinterviews.docx
+++ b/docs/user-guide/en/pages/09-exitinterviews.docx
@@ -1381,7 +1381,144 @@
         <w:pStyle w:val="Heading2"/>
       </w:pPr>
       <w:r>
-        <w:t xml:space="preserve">Step 7 - Engagement drivers</w:t>
+        <w:t xml:space="preserve">Step 7 - Who is leaving?</w:t>
+      </w:r>
+    </w:p>
+    <w:tbl>
+      <w:tblPr>
+        <w:tblW w:type="dxa" w:w="11000"/>
+        <w:jc w:val="center"/>
+        <w:tblBorders>
+          <w:top w:val="single" w:color="auto" w:sz="4"/>
+          <w:left w:val="single" w:color="auto" w:sz="4"/>
+          <w:bottom w:val="single" w:color="auto" w:sz="4"/>
+          <w:right w:val="single" w:color="auto" w:sz="4"/>
+          <w:insideH w:val="single" w:color="auto" w:sz="4"/>
+          <w:insideV w:val="single" w:color="auto" w:sz="4"/>
+        </w:tblBorders>
+      </w:tblPr>
+      <w:tblGrid>
+        <w:gridCol w:w="5500"/>
+        <w:gridCol w:w="5500"/>
+      </w:tblGrid>
+      <w:tr>
+        <w:tc>
+          <w:tcPr>
+            <w:tcW w:type="dxa" w:w="5500"/>
+            <w:tcBorders>
+              <w:top w:val="none" w:color="FFFFFF" w:sz="0"/>
+              <w:left w:val="none" w:color="FFFFFF" w:sz="0"/>
+              <w:bottom w:val="none" w:color="FFFFFF" w:sz="0"/>
+              <w:right w:val="none" w:color="FFFFFF" w:sz="0"/>
+            </w:tcBorders>
+            <w:tcMar>
+              <w:top w:type="dxa" w:w="40"/>
+              <w:left w:type="dxa" w:w="70"/>
+              <w:bottom w:type="dxa" w:w="60"/>
+              <w:right w:type="dxa" w:w="70"/>
+            </w:tcMar>
+          </w:tcPr>
+          <w:p>
+            <w:pPr>
+              <w:keepNext/>
+              <w:spacing w:after="120" w:before="60"/>
+              <w:jc w:val="center"/>
+            </w:pPr>
+            <w:r>
+              <w:drawing>
+                <wp:inline distT="0" distB="0" distL="0" distR="0">
+                  <wp:extent cx="3286125" cy="1590675"/>
+                  <wp:effectExtent t="0" r="0" b="0" l="0"/>
+                  <wp:docPr id="1" name="" descr="" title=""/>
+                  <wp:cNvGraphicFramePr>
+                    <a:graphicFrameLocks xmlns:a="http://schemas.openxmlformats.org/drawingml/2006/main" noChangeAspect="1"/>
+                  </wp:cNvGraphicFramePr>
+                  <a:graphic xmlns:a="http://schemas.openxmlformats.org/drawingml/2006/main">
+                    <a:graphicData uri="http://schemas.openxmlformats.org/drawingml/2006/picture">
+                      <pic:pic xmlns:pic="http://schemas.openxmlformats.org/drawingml/2006/picture">
+                        <pic:nvPicPr>
+                          <pic:cNvPr id="0" name="" descr=""/>
+                          <pic:cNvPicPr>
+                            <a:picLocks noChangeAspect="1" noChangeArrowheads="1"/>
+                          </pic:cNvPicPr>
+                        </pic:nvPicPr>
+                        <pic:blipFill>
+                          <a:blip r:embed="rId24" cstate="none"/>
+                          <a:srcRect/>
+                          <a:stretch>
+                            <a:fillRect/>
+                          </a:stretch>
+                        </pic:blipFill>
+                        <pic:spPr bwMode="auto">
+                          <a:xfrm>
+                            <a:off x="0" y="0"/>
+                            <a:ext cx="3286125" cy="1590675"/>
+                          </a:xfrm>
+                          <a:prstGeom prst="rect">
+                            <a:avLst/>
+                          </a:prstGeom>
+                        </pic:spPr>
+                      </pic:pic>
+                    </a:graphicData>
+                  </a:graphic>
+                </wp:inline>
+              </w:drawing>
+            </w:r>
+          </w:p>
+        </w:tc>
+        <w:tc>
+          <w:tcPr>
+            <w:tcW w:type="dxa" w:w="5500"/>
+            <w:tcBorders>
+              <w:top w:val="none" w:color="FFFFFF" w:sz="0"/>
+              <w:left w:val="none" w:color="FFFFFF" w:sz="0"/>
+              <w:bottom w:val="none" w:color="FFFFFF" w:sz="0"/>
+              <w:right w:val="none" w:color="FFFFFF" w:sz="0"/>
+            </w:tcBorders>
+            <w:tcMar>
+              <w:top w:type="dxa" w:w="40"/>
+              <w:left w:type="dxa" w:w="70"/>
+              <w:bottom w:type="dxa" w:w="60"/>
+              <w:right w:type="dxa" w:w="70"/>
+            </w:tcMar>
+          </w:tcPr>
+          <w:p>
+            <w:pPr>
+              <w:spacing w:after="70" w:line="270"/>
+            </w:pPr>
+            <w:r>
+              <w:rPr>
+                <w:rFonts w:ascii="Arial" w:cs="Arial" w:eastAsia="Arial" w:hAnsi="Arial"/>
+                <w:color w:val="27251F"/>
+                <w:sz w:val="21"/>
+                <w:szCs w:val="21"/>
+              </w:rPr>
+              <w:t xml:space="preserve">Exit interview responses grouped by the departing employee's job title.</w:t>
+            </w:r>
+          </w:p>
+        </w:tc>
+      </w:tr>
+    </w:tbl>
+    <w:p>
+      <w:pPr>
+        <w:spacing w:after="30"/>
+      </w:pPr>
+      <w:r>
+        <w:rPr>
+          <w:rFonts w:ascii="Arial" w:cs="Arial" w:eastAsia="Arial" w:hAnsi="Arial"/>
+          <w:color w:val="27251F"/>
+          <w:sz w:val="21"/>
+          <w:szCs w:val="21"/>
+        </w:rPr>
+        <w:t xml:space="preserve"/>
+      </w:r>
+    </w:p>
+    <w:p>
+      <w:pPr>
+        <w:pStyle w:val="Heading2"/>
+      </w:pPr>
+      <w:r>
+        <w:t xml:space="preserve">Step 8 - Engagement drivers</w:t>
       </w:r>
     </w:p>
     <w:tbl>
@@ -1443,7 +1580,7 @@
                           </pic:cNvPicPr>
                         </pic:nvPicPr>
                         <pic:blipFill>
-                          <a:blip r:embed="rId24" cstate="none"/>
+                          <a:blip r:embed="rId25" cstate="none"/>
                           <a:srcRect/>
                           <a:stretch>
                             <a:fillRect/>
@@ -1507,7 +1644,7 @@
                           </pic:cNvPicPr>
                         </pic:nvPicPr>
                         <pic:blipFill>
-                          <a:blip r:embed="rId25" cstate="none"/>
+                          <a:blip r:embed="rId26" cstate="none"/>
                           <a:srcRect/>
                           <a:stretch>
                             <a:fillRect/>
@@ -1576,143 +1713,6 @@
         <w:pStyle w:val="Heading2"/>
       </w:pPr>
       <w:r>
-        <w:t xml:space="preserve">Step 8 - Who is leaving?</w:t>
-      </w:r>
-    </w:p>
-    <w:tbl>
-      <w:tblPr>
-        <w:tblW w:type="dxa" w:w="11000"/>
-        <w:jc w:val="center"/>
-        <w:tblBorders>
-          <w:top w:val="single" w:color="auto" w:sz="4"/>
-          <w:left w:val="single" w:color="auto" w:sz="4"/>
-          <w:bottom w:val="single" w:color="auto" w:sz="4"/>
-          <w:right w:val="single" w:color="auto" w:sz="4"/>
-          <w:insideH w:val="single" w:color="auto" w:sz="4"/>
-          <w:insideV w:val="single" w:color="auto" w:sz="4"/>
-        </w:tblBorders>
-      </w:tblPr>
-      <w:tblGrid>
-        <w:gridCol w:w="5500"/>
-        <w:gridCol w:w="5500"/>
-      </w:tblGrid>
-      <w:tr>
-        <w:tc>
-          <w:tcPr>
-            <w:tcW w:type="dxa" w:w="5500"/>
-            <w:tcBorders>
-              <w:top w:val="none" w:color="FFFFFF" w:sz="0"/>
-              <w:left w:val="none" w:color="FFFFFF" w:sz="0"/>
-              <w:bottom w:val="none" w:color="FFFFFF" w:sz="0"/>
-              <w:right w:val="none" w:color="FFFFFF" w:sz="0"/>
-            </w:tcBorders>
-            <w:tcMar>
-              <w:top w:type="dxa" w:w="40"/>
-              <w:left w:type="dxa" w:w="70"/>
-              <w:bottom w:type="dxa" w:w="60"/>
-              <w:right w:type="dxa" w:w="70"/>
-            </w:tcMar>
-          </w:tcPr>
-          <w:p>
-            <w:pPr>
-              <w:keepNext/>
-              <w:spacing w:after="120" w:before="60"/>
-              <w:jc w:val="center"/>
-            </w:pPr>
-            <w:r>
-              <w:drawing>
-                <wp:inline distT="0" distB="0" distL="0" distR="0">
-                  <wp:extent cx="3286125" cy="1590675"/>
-                  <wp:effectExtent t="0" r="0" b="0" l="0"/>
-                  <wp:docPr id="1" name="" descr="" title=""/>
-                  <wp:cNvGraphicFramePr>
-                    <a:graphicFrameLocks xmlns:a="http://schemas.openxmlformats.org/drawingml/2006/main" noChangeAspect="1"/>
-                  </wp:cNvGraphicFramePr>
-                  <a:graphic xmlns:a="http://schemas.openxmlformats.org/drawingml/2006/main">
-                    <a:graphicData uri="http://schemas.openxmlformats.org/drawingml/2006/picture">
-                      <pic:pic xmlns:pic="http://schemas.openxmlformats.org/drawingml/2006/picture">
-                        <pic:nvPicPr>
-                          <pic:cNvPr id="0" name="" descr=""/>
-                          <pic:cNvPicPr>
-                            <a:picLocks noChangeAspect="1" noChangeArrowheads="1"/>
-                          </pic:cNvPicPr>
-                        </pic:nvPicPr>
-                        <pic:blipFill>
-                          <a:blip r:embed="rId26" cstate="none"/>
-                          <a:srcRect/>
-                          <a:stretch>
-                            <a:fillRect/>
-                          </a:stretch>
-                        </pic:blipFill>
-                        <pic:spPr bwMode="auto">
-                          <a:xfrm>
-                            <a:off x="0" y="0"/>
-                            <a:ext cx="3286125" cy="1590675"/>
-                          </a:xfrm>
-                          <a:prstGeom prst="rect">
-                            <a:avLst/>
-                          </a:prstGeom>
-                        </pic:spPr>
-                      </pic:pic>
-                    </a:graphicData>
-                  </a:graphic>
-                </wp:inline>
-              </w:drawing>
-            </w:r>
-          </w:p>
-        </w:tc>
-        <w:tc>
-          <w:tcPr>
-            <w:tcW w:type="dxa" w:w="5500"/>
-            <w:tcBorders>
-              <w:top w:val="none" w:color="FFFFFF" w:sz="0"/>
-              <w:left w:val="none" w:color="FFFFFF" w:sz="0"/>
-              <w:bottom w:val="none" w:color="FFFFFF" w:sz="0"/>
-              <w:right w:val="none" w:color="FFFFFF" w:sz="0"/>
-            </w:tcBorders>
-            <w:tcMar>
-              <w:top w:type="dxa" w:w="40"/>
-              <w:left w:type="dxa" w:w="70"/>
-              <w:bottom w:type="dxa" w:w="60"/>
-              <w:right w:type="dxa" w:w="70"/>
-            </w:tcMar>
-          </w:tcPr>
-          <w:p>
-            <w:pPr>
-              <w:spacing w:after="70" w:line="270"/>
-            </w:pPr>
-            <w:r>
-              <w:rPr>
-                <w:rFonts w:ascii="Arial" w:cs="Arial" w:eastAsia="Arial" w:hAnsi="Arial"/>
-                <w:color w:val="27251F"/>
-                <w:sz w:val="21"/>
-                <w:szCs w:val="21"/>
-              </w:rPr>
-              <w:t xml:space="preserve">Exit interview responses grouped by the departing employee's job title.</w:t>
-            </w:r>
-          </w:p>
-        </w:tc>
-      </w:tr>
-    </w:tbl>
-    <w:p>
-      <w:pPr>
-        <w:spacing w:after="30"/>
-      </w:pPr>
-      <w:r>
-        <w:rPr>
-          <w:rFonts w:ascii="Arial" w:cs="Arial" w:eastAsia="Arial" w:hAnsi="Arial"/>
-          <w:color w:val="27251F"/>
-          <w:sz w:val="21"/>
-          <w:szCs w:val="21"/>
-        </w:rPr>
-        <w:t xml:space="preserve"/>
-      </w:r>
-    </w:p>
-    <w:p>
-      <w:pPr>
-        <w:pStyle w:val="Heading2"/>
-      </w:pPr>
-      <w:r>
         <w:t xml:space="preserve">Step 9 - Read what people wrote</w:t>
       </w:r>
     </w:p>
@@ -1725,7 +1725,7 @@
       <w:r>
         <w:drawing>
           <wp:inline distT="0" distB="0" distL="0" distR="0">
-            <wp:extent cx="6953250" cy="2457450"/>
+            <wp:extent cx="5334000" cy="1609725"/>
             <wp:effectExtent t="0" r="0" b="0" l="0"/>
             <wp:docPr id="1" name="" descr="" title=""/>
             <wp:cNvGraphicFramePr>
@@ -1750,7 +1750,7 @@
                   <pic:spPr bwMode="auto">
                     <a:xfrm>
                       <a:off x="0" y="0"/>
-                      <a:ext cx="6953250" cy="2457450"/>
+                      <a:ext cx="5334000" cy="1609725"/>
                     </a:xfrm>
                     <a:prstGeom prst="rect">
                       <a:avLst/>
@@ -1786,7 +1786,7 @@
       <w:r>
         <w:drawing>
           <wp:inline distT="0" distB="0" distL="0" distR="0">
-            <wp:extent cx="6953250" cy="2457450"/>
+            <wp:extent cx="5334000" cy="1609725"/>
             <wp:effectExtent t="0" r="0" b="0" l="0"/>
             <wp:docPr id="1" name="" descr="" title=""/>
             <wp:cNvGraphicFramePr>
@@ -1811,7 +1811,7 @@
                   <pic:spPr bwMode="auto">
                     <a:xfrm>
                       <a:off x="0" y="0"/>
-                      <a:ext cx="6953250" cy="2457450"/>
+                      <a:ext cx="5334000" cy="1609725"/>
                     </a:xfrm>
                     <a:prstGeom prst="rect">
                       <a:avLst/>

</xml_diff>